<commit_message>
Update Scenario 1 files with public permissions
Co-authored-by: Copilot <223556219+Copilot@users.noreply.github.com>
</commit_message>
<xml_diff>
--- a/Contoso_Live_Prompt_Script.docx
+++ b/Contoso_Live_Prompt_Script.docx
@@ -54,12 +54,6 @@
         <w:gridCol w:w="9360"/>
       </w:tblGrid>
       <w:tr>
-        <w:tblPrEx>
-          <w:tblCellMar>
-            <w:top w:w="0" w:type="dxa"/>
-            <w:bottom w:w="0" w:type="dxa"/>
-          </w:tblCellMar>
-        </w:tblPrEx>
         <w:tc>
           <w:tcPr>
             <w:tcW w:w="9360" w:type="dxa"/>
@@ -296,12 +290,6 @@
         <w:gridCol w:w="9360"/>
       </w:tblGrid>
       <w:tr>
-        <w:tblPrEx>
-          <w:tblCellMar>
-            <w:top w:w="0" w:type="dxa"/>
-            <w:bottom w:w="0" w:type="dxa"/>
-          </w:tblCellMar>
-        </w:tblPrEx>
         <w:tc>
           <w:tcPr>
             <w:tcW w:w="9360" w:type="dxa"/>
@@ -405,12 +393,6 @@
         <w:gridCol w:w="9360"/>
       </w:tblGrid>
       <w:tr>
-        <w:tblPrEx>
-          <w:tblCellMar>
-            <w:top w:w="0" w:type="dxa"/>
-            <w:bottom w:w="0" w:type="dxa"/>
-          </w:tblCellMar>
-        </w:tblPrEx>
         <w:tc>
           <w:tcPr>
             <w:tcW w:w="9360" w:type="dxa"/>
@@ -514,12 +496,6 @@
         <w:gridCol w:w="9360"/>
       </w:tblGrid>
       <w:tr>
-        <w:tblPrEx>
-          <w:tblCellMar>
-            <w:top w:w="0" w:type="dxa"/>
-            <w:bottom w:w="0" w:type="dxa"/>
-          </w:tblCellMar>
-        </w:tblPrEx>
         <w:tc>
           <w:tcPr>
             <w:tcW w:w="9360" w:type="dxa"/>
@@ -623,12 +599,6 @@
         <w:gridCol w:w="9360"/>
       </w:tblGrid>
       <w:tr>
-        <w:tblPrEx>
-          <w:tblCellMar>
-            <w:top w:w="0" w:type="dxa"/>
-            <w:bottom w:w="0" w:type="dxa"/>
-          </w:tblCellMar>
-        </w:tblPrEx>
         <w:tc>
           <w:tcPr>
             <w:tcW w:w="9360" w:type="dxa"/>
@@ -732,12 +702,6 @@
         <w:gridCol w:w="9360"/>
       </w:tblGrid>
       <w:tr>
-        <w:tblPrEx>
-          <w:tblCellMar>
-            <w:top w:w="0" w:type="dxa"/>
-            <w:bottom w:w="0" w:type="dxa"/>
-          </w:tblCellMar>
-        </w:tblPrEx>
         <w:tc>
           <w:tcPr>
             <w:tcW w:w="9360" w:type="dxa"/>
@@ -854,12 +818,6 @@
         <w:gridCol w:w="9360"/>
       </w:tblGrid>
       <w:tr>
-        <w:tblPrEx>
-          <w:tblCellMar>
-            <w:top w:w="0" w:type="dxa"/>
-            <w:bottom w:w="0" w:type="dxa"/>
-          </w:tblCellMar>
-        </w:tblPrEx>
         <w:tc>
           <w:tcPr>
             <w:tcW w:w="9360" w:type="dxa"/>
@@ -963,12 +921,6 @@
         <w:gridCol w:w="9360"/>
       </w:tblGrid>
       <w:tr>
-        <w:tblPrEx>
-          <w:tblCellMar>
-            <w:top w:w="0" w:type="dxa"/>
-            <w:bottom w:w="0" w:type="dxa"/>
-          </w:tblCellMar>
-        </w:tblPrEx>
         <w:tc>
           <w:tcPr>
             <w:tcW w:w="9360" w:type="dxa"/>
@@ -1229,12 +1181,6 @@
         <w:gridCol w:w="9360"/>
       </w:tblGrid>
       <w:tr>
-        <w:tblPrEx>
-          <w:tblCellMar>
-            <w:top w:w="0" w:type="dxa"/>
-            <w:bottom w:w="0" w:type="dxa"/>
-          </w:tblCellMar>
-        </w:tblPrEx>
         <w:tc>
           <w:tcPr>
             <w:tcW w:w="9360" w:type="dxa"/>
@@ -1374,12 +1320,6 @@
         <w:gridCol w:w="9360"/>
       </w:tblGrid>
       <w:tr>
-        <w:tblPrEx>
-          <w:tblCellMar>
-            <w:top w:w="0" w:type="dxa"/>
-            <w:bottom w:w="0" w:type="dxa"/>
-          </w:tblCellMar>
-        </w:tblPrEx>
         <w:tc>
           <w:tcPr>
             <w:tcW w:w="9360" w:type="dxa"/>
@@ -1411,12 +1351,6 @@
         </w:tc>
       </w:tr>
       <w:tr>
-        <w:tblPrEx>
-          <w:tblCellMar>
-            <w:top w:w="0" w:type="dxa"/>
-            <w:bottom w:w="0" w:type="dxa"/>
-          </w:tblCellMar>
-        </w:tblPrEx>
         <w:tc>
           <w:tcPr>
             <w:tcW w:w="9360" w:type="dxa"/>
@@ -1448,12 +1382,6 @@
         </w:tc>
       </w:tr>
       <w:tr>
-        <w:tblPrEx>
-          <w:tblCellMar>
-            <w:top w:w="0" w:type="dxa"/>
-            <w:bottom w:w="0" w:type="dxa"/>
-          </w:tblCellMar>
-        </w:tblPrEx>
         <w:tc>
           <w:tcPr>
             <w:tcW w:w="9360" w:type="dxa"/>
@@ -1563,12 +1491,6 @@
         <w:gridCol w:w="9360"/>
       </w:tblGrid>
       <w:tr>
-        <w:tblPrEx>
-          <w:tblCellMar>
-            <w:top w:w="0" w:type="dxa"/>
-            <w:bottom w:w="0" w:type="dxa"/>
-          </w:tblCellMar>
-        </w:tblPrEx>
         <w:tc>
           <w:tcPr>
             <w:tcW w:w="9360" w:type="dxa"/>
@@ -2765,4 +2687,10 @@
     </a:ext>
   </a:extLst>
 </a:theme>
+</file>
+
+<file path=docMetadata/LabelInfo.xml><?xml version="1.0" encoding="utf-8"?>
+<clbl:labelList xmlns:clbl="http://schemas.microsoft.com/office/2020/mipLabelMetadata">
+  <clbl:label id="{87867195-f2b8-4ac2-b0b6-6bb73cb33afc}" enabled="1" method="Privileged" siteId="{72f988bf-86f1-41af-91ab-2d7cd011db47}" removed="0"/>
+</clbl:labelList>
 </file>
</xml_diff>